<commit_message>
Fix maternity capital dates in minor contract template
</commit_message>
<xml_diff>
--- a/backend/templates/contract-minor.docx
+++ b/backend/templates/contract-minor.docx
@@ -1689,24 +1689,73 @@
           <w:sz w:val="20"/>
           <w:szCs w:val="20"/>
         </w:rPr>
-        <w:t xml:space="preserve">5.5. В случае оплаты за проживание средствами материнского (семейного) капитала, оплата производится единовременным платежом {matCapitalText}</w:t>
-      </w:r>
-    </w:p>
-    <w:p>
-      <w:pPr>
-        <w:pStyle w:val="ConsPlusNormal"/>
-        <w:jc w:val="both"/>
-        <w:rPr>
-          <w:rFonts w:ascii="Times New Roman" w:hAnsi="Times New Roman" w:cs="Times New Roman"/>
-          <w:szCs w:val="20"/>
-        </w:rPr>
-      </w:pPr>
-      <w:r>
-        <w:rPr>
-          <w:rFonts w:ascii="Times New Roman" w:hAnsi="Times New Roman" w:cs="Times New Roman"/>
-          <w:szCs w:val="20"/>
-        </w:rPr>
-        <w:t xml:space="preserve">_________________________________________________ с возможностью отсрочки оплаты до _______________.</w:t>
+        <w:t xml:space="preserve">5.5. В случае оплаты за проживание средствами материнского (семейного) капитала, оплата производится единовременным платежом за период с </w:t>
+      </w:r>
+      <w:r>
+        <w:rPr>
+          <w:rFonts w:ascii="Times New Roman" w:hAnsi="Times New Roman" w:cs="Times New Roman"/>
+          <w:sz w:val="20"/>
+          <w:szCs w:val="20"/>
+          <w:u w:val="single"/>
+        </w:rPr>
+        <w:t>{matCapitalCoveredFrom}</w:t>
+      </w:r>
+      <w:r>
+        <w:rPr>
+          <w:rFonts w:ascii="Times New Roman" w:hAnsi="Times New Roman" w:cs="Times New Roman"/>
+          <w:sz w:val="20"/>
+          <w:szCs w:val="20"/>
+        </w:rPr>
+        <w:t xml:space="preserve"> по </w:t>
+      </w:r>
+      <w:r>
+        <w:rPr>
+          <w:rFonts w:ascii="Times New Roman" w:hAnsi="Times New Roman" w:cs="Times New Roman"/>
+          <w:sz w:val="20"/>
+          <w:szCs w:val="20"/>
+          <w:u w:val="single"/>
+        </w:rPr>
+        <w:t>{matCapitalCoveredTo}</w:t>
+      </w:r>
+      <w:r>
+        <w:rPr>
+          <w:rFonts w:ascii="Times New Roman" w:hAnsi="Times New Roman" w:cs="Times New Roman"/>
+          <w:sz w:val="20"/>
+          <w:szCs w:val="20"/>
+        </w:rPr>
+        <w:t xml:space="preserve"> в сумме {matCapitalAmount}</w:t>
+      </w:r>
+    </w:p>
+    <w:p>
+      <w:pPr>
+        <w:pStyle w:val="ConsPlusNormal"/>
+        <w:jc w:val="both"/>
+        <w:rPr>
+          <w:rFonts w:ascii="Times New Roman" w:hAnsi="Times New Roman" w:cs="Times New Roman"/>
+          <w:szCs w:val="20"/>
+        </w:rPr>
+      </w:pPr>
+      <w:r>
+        <w:rPr>
+          <w:rFonts w:ascii="Times New Roman" w:hAnsi="Times New Roman" w:cs="Times New Roman"/>
+          <w:szCs w:val="20"/>
+        </w:rPr>
+        <w:t xml:space="preserve">с возможностью отсрочки оплаты до </w:t>
+      </w:r>
+      <w:r>
+        <w:rPr>
+          <w:rFonts w:ascii="Times New Roman" w:hAnsi="Times New Roman" w:cs="Times New Roman"/>
+          <w:szCs w:val="20"/>
+          <w:u w:val="single"/>
+        </w:rPr>
+        <w:t>{matCapitalDeferredUntil}</w:t>
+      </w:r>
+      <w:r>
+        <w:rPr>
+          <w:rFonts w:ascii="Times New Roman" w:hAnsi="Times New Roman" w:cs="Times New Roman"/>
+          <w:szCs w:val="20"/>
+        </w:rPr>
+        <w:t>.</w:t>
       </w:r>
     </w:p>
     <w:p>

</xml_diff>